<commit_message>
Resolución del TP4 - Parte B
</commit_message>
<xml_diff>
--- a/docs/entregas/TP4-Summate.docx
+++ b/docs/entregas/TP4-Summate.docx
@@ -1,6 +1,6 @@
 
 <file path=word/document.xml><?xml version="1.0" encoding="utf-8"?>
-<w:document xmlns:wpc="http://schemas.microsoft.com/office/word/2010/wordprocessingCanvas" xmlns:cx="http://schemas.microsoft.com/office/drawing/2014/chartex" xmlns:cx1="http://schemas.microsoft.com/office/drawing/2015/9/8/chartex" xmlns:cx2="http://schemas.microsoft.com/office/drawing/2015/10/21/chartex" xmlns:cx3="http://schemas.microsoft.com/office/drawing/2016/5/9/chartex" xmlns:cx4="http://schemas.microsoft.com/office/drawing/2016/5/10/chartex" xmlns:cx5="http://schemas.microsoft.com/office/drawing/2016/5/11/chartex" xmlns:cx6="http://schemas.microsoft.com/office/drawing/2016/5/12/chartex" xmlns:cx7="http://schemas.microsoft.com/office/drawing/2016/5/13/chartex" xmlns:cx8="http://schemas.microsoft.com/office/drawing/2016/5/14/chartex" xmlns:mc="http://schemas.openxmlformats.org/markup-compatibility/2006" xmlns:m="http://schemas.openxmlformats.org/officeDocument/2006/math" xmlns:aink="http://schemas.microsoft.com/office/drawing/2016/ink" xmlns:am3d="http://schemas.microsoft.com/office/drawing/2017/model3d" xmlns:oel="http://schemas.microsoft.com/office/2019/extlst" xmlns:r="http://schemas.openxmlformats.org/officeDocument/2006/relationships" xmlns:wp14="http://schemas.microsoft.com/office/word/2010/wordprocessingDrawing" xmlns:wp="http://schemas.openxmlformats.org/drawingml/2006/wordprocessingDrawing" xmlns:wpg="http://schemas.microsoft.com/office/word/2010/wordprocessingGroup" xmlns:wpi="http://schemas.microsoft.com/office/word/2010/wordprocessingInk" xmlns:wps="http://schemas.microsoft.com/office/word/2010/wordprocessingShape" xmlns:o="urn:schemas-microsoft-com:office:office" xmlns:v="urn:schemas-microsoft-com:vml" xmlns:w10="urn:schemas-microsoft-com:office:word" xmlns:w="http://schemas.openxmlformats.org/wordprocessingml/2006/main" xmlns:w14="http://schemas.microsoft.com/office/word/2010/wordml" xmlns:w15="http://schemas.microsoft.com/office/word/2012/wordml" xmlns:w16cex="http://schemas.microsoft.com/office/word/2018/wordml/cex" xmlns:w16cid="http://schemas.microsoft.com/office/word/2016/wordml/cid" xmlns:w16="http://schemas.microsoft.com/office/word/2018/wordml" xmlns:w16sdtdh="http://schemas.microsoft.com/office/word/2020/wordml/sdtdatahash" xmlns:w16sdtfl="http://schemas.microsoft.com/office/word/2024/wordml/sdtformatlock" xmlns:w16se="http://schemas.microsoft.com/office/word/2015/wordml/symex" xmlns:w16du="http://schemas.microsoft.com/office/word/2023/wordml/word16du" xmlns:wne="http://schemas.microsoft.com/office/word/2006/wordml" mc:Ignorable="w14 w15 w16se w16cid w16 w16cex w16sdtdh w16sdtfl w16du wp14">
+<w:document xmlns:wpc="http://schemas.microsoft.com/office/word/2010/wordprocessingCanvas" xmlns:cx="http://schemas.microsoft.com/office/drawing/2014/chartex" xmlns:cx1="http://schemas.microsoft.com/office/drawing/2015/9/8/chartex" xmlns:cx2="http://schemas.microsoft.com/office/drawing/2015/10/21/chartex" xmlns:cx3="http://schemas.microsoft.com/office/drawing/2016/5/9/chartex" xmlns:cx4="http://schemas.microsoft.com/office/drawing/2016/5/10/chartex" xmlns:cx5="http://schemas.microsoft.com/office/drawing/2016/5/11/chartex" xmlns:cx6="http://schemas.microsoft.com/office/drawing/2016/5/12/chartex" xmlns:cx7="http://schemas.microsoft.com/office/drawing/2016/5/13/chartex" xmlns:cx8="http://schemas.microsoft.com/office/drawing/2016/5/14/chartex" xmlns:mc="http://schemas.openxmlformats.org/markup-compatibility/2006" xmlns:aink="http://schemas.microsoft.com/office/drawing/2016/ink" xmlns:am3d="http://schemas.microsoft.com/office/drawing/2017/model3d" xmlns:o="urn:schemas-microsoft-com:office:office" xmlns:oel="http://schemas.microsoft.com/office/2019/extlst" xmlns:r="http://schemas.openxmlformats.org/officeDocument/2006/relationships" xmlns:m="http://schemas.openxmlformats.org/officeDocument/2006/math" xmlns:v="urn:schemas-microsoft-com:vml" xmlns:wp14="http://schemas.microsoft.com/office/word/2010/wordprocessingDrawing" xmlns:wp="http://schemas.openxmlformats.org/drawingml/2006/wordprocessingDrawing" xmlns:w10="urn:schemas-microsoft-com:office:word" xmlns:w="http://schemas.openxmlformats.org/wordprocessingml/2006/main" xmlns:w14="http://schemas.microsoft.com/office/word/2010/wordml" xmlns:w15="http://schemas.microsoft.com/office/word/2012/wordml" xmlns:w16cex="http://schemas.microsoft.com/office/word/2018/wordml/cex" xmlns:w16cid="http://schemas.microsoft.com/office/word/2016/wordml/cid" xmlns:w16="http://schemas.microsoft.com/office/word/2018/wordml" xmlns:w16du="http://schemas.microsoft.com/office/word/2023/wordml/word16du" xmlns:w16sdtdh="http://schemas.microsoft.com/office/word/2020/wordml/sdtdatahash" xmlns:w16sdtfl="http://schemas.microsoft.com/office/word/2024/wordml/sdtformatlock" xmlns:w16se="http://schemas.microsoft.com/office/word/2015/wordml/symex" xmlns:wpg="http://schemas.microsoft.com/office/word/2010/wordprocessingGroup" xmlns:wpi="http://schemas.microsoft.com/office/word/2010/wordprocessingInk" xmlns:wne="http://schemas.microsoft.com/office/word/2006/wordml" xmlns:wps="http://schemas.microsoft.com/office/word/2010/wordprocessingShape" mc:Ignorable="w14 w15 w16se w16cid w16 w16cex w16sdtdh w16sdtfl w16du wp14">
   <w:body>
     <w:p>
       <w:pPr>
@@ -205,7 +205,6 @@
         </w:rPr>
         <w:t xml:space="preserve">Equipo: </w:t>
       </w:r>
-      <w:proofErr w:type="spellStart"/>
       <w:r>
         <w:rPr>
           <w:rFonts w:cs="Arial"/>
@@ -216,7 +215,6 @@
         </w:rPr>
         <w:t>Summate</w:t>
       </w:r>
-      <w:proofErr w:type="spellEnd"/>
     </w:p>
     <w:p>
       <w:pPr>
@@ -434,14 +432,12 @@
                 <w:lang w:val="es-AR"/>
               </w:rPr>
             </w:pPr>
-            <w:proofErr w:type="spellStart"/>
             <w:r>
               <w:rPr>
                 <w:lang w:val="es-AR"/>
               </w:rPr>
               <w:t>Agasi</w:t>
             </w:r>
-            <w:proofErr w:type="spellEnd"/>
           </w:p>
         </w:tc>
         <w:tc>
@@ -722,14 +718,12 @@
                 <w:lang w:val="es-AR"/>
               </w:rPr>
             </w:pPr>
-            <w:proofErr w:type="spellStart"/>
             <w:r>
               <w:rPr>
                 <w:lang w:val="es-AR"/>
               </w:rPr>
               <w:t>Naspleda</w:t>
             </w:r>
-            <w:proofErr w:type="spellEnd"/>
           </w:p>
         </w:tc>
         <w:tc>
@@ -868,14 +862,12 @@
                 <w:lang w:val="es-AR"/>
               </w:rPr>
             </w:pPr>
-            <w:proofErr w:type="spellStart"/>
             <w:r>
               <w:rPr>
                 <w:lang w:val="es-AR"/>
               </w:rPr>
               <w:t>Panigazzi</w:t>
             </w:r>
-            <w:proofErr w:type="spellEnd"/>
           </w:p>
         </w:tc>
         <w:tc>
@@ -1013,14 +1005,12 @@
                 <w:lang w:val="es-AR"/>
               </w:rPr>
             </w:pPr>
-            <w:proofErr w:type="spellStart"/>
             <w:r>
               <w:rPr>
                 <w:lang w:val="es-AR"/>
               </w:rPr>
               <w:t>Rios</w:t>
             </w:r>
-            <w:proofErr w:type="spellEnd"/>
           </w:p>
         </w:tc>
         <w:tc>
@@ -1463,7 +1453,7 @@
                 <w:noProof/>
                 <w:webHidden/>
               </w:rPr>
-              <w:t>6</w:t>
+              <w:t>5</w:t>
             </w:r>
             <w:r>
               <w:rPr>
@@ -1538,7 +1528,82 @@
                 <w:noProof/>
                 <w:webHidden/>
               </w:rPr>
-              <w:t>7</w:t>
+              <w:t>6</w:t>
+            </w:r>
+            <w:r>
+              <w:rPr>
+                <w:noProof/>
+                <w:webHidden/>
+              </w:rPr>
+              <w:fldChar w:fldCharType="end"/>
+            </w:r>
+          </w:hyperlink>
+        </w:p>
+        <w:p>
+          <w:pPr>
+            <w:pStyle w:val="TDC1"/>
+            <w:rPr>
+              <w:rFonts w:asciiTheme="minorHAnsi" w:hAnsiTheme="minorHAnsi"/>
+              <w:b w:val="0"/>
+              <w:noProof/>
+              <w:color w:val="auto"/>
+              <w:kern w:val="2"/>
+              <w:sz w:val="24"/>
+              <w:szCs w:val="24"/>
+              <w:lang w:val="es-AR" w:eastAsia="es-AR"/>
+              <w14:ligatures w14:val="standardContextual"/>
+            </w:rPr>
+          </w:pPr>
+          <w:hyperlink w:anchor="_TocPoint6" w:history="1">
+            <w:r>
+              <w:rPr>
+                <w:rStyle w:val="Hipervnculo"/>
+                <w:rFonts w:cs="Arial"/>
+                <w:noProof/>
+                <w:lang w:val="es-AR"/>
+              </w:rPr>
+              <w:t>6. Respuesta del equipo evaluado</w:t>
+            </w:r>
+            <w:r>
+              <w:rPr>
+                <w:noProof/>
+                <w:webHidden/>
+              </w:rPr>
+              <w:tab/>
+            </w:r>
+            <w:r>
+              <w:rPr>
+                <w:noProof/>
+                <w:webHidden/>
+              </w:rPr>
+              <w:fldChar w:fldCharType="begin"/>
+            </w:r>
+            <w:r>
+              <w:rPr>
+                <w:noProof/>
+                <w:webHidden/>
+              </w:rPr>
+              <w:instrText xml:space="preserve"> PAGEREF _TocPoint6 \h </w:instrText>
+            </w:r>
+            <w:r>
+              <w:rPr>
+                <w:noProof/>
+                <w:webHidden/>
+              </w:rPr>
+            </w:r>
+            <w:r>
+              <w:rPr>
+                <w:noProof/>
+                <w:webHidden/>
+              </w:rPr>
+              <w:fldChar w:fldCharType="separate"/>
+            </w:r>
+            <w:r>
+              <w:rPr>
+                <w:noProof/>
+                <w:webHidden/>
+              </w:rPr>
+              <w:t>8</w:t>
             </w:r>
             <w:r>
               <w:rPr>
@@ -1606,17 +1671,9 @@
         <w:rPr>
           <w:lang w:val="es-AR"/>
         </w:rPr>
-        <w:t xml:space="preserve">1. Antes de mirar el </w:t>
-      </w:r>
-      <w:proofErr w:type="spellStart"/>
-      <w:r>
-        <w:rPr>
-          <w:lang w:val="es-AR"/>
-        </w:rPr>
-        <w:t>wireframe</w:t>
+        <w:t>1. Antes de mirar el wireframe</w:t>
       </w:r>
       <w:bookmarkEnd w:id="0"/>
-      <w:proofErr w:type="spellEnd"/>
     </w:p>
     <w:p>
       <w:pPr>
@@ -1633,20 +1690,8 @@
           <w:sz w:val="22"/>
           <w:lang w:val="es-AR"/>
         </w:rPr>
-        <w:t xml:space="preserve">Perfil del equipo evaluado — </w:t>
+        <w:t>Perfil del equipo evaluado — Followare</w:t>
       </w:r>
-      <w:proofErr w:type="spellStart"/>
-      <w:r>
-        <w:rPr>
-          <w:rFonts w:cs="Arial"/>
-          <w:b/>
-          <w:color w:val="1F4E79"/>
-          <w:sz w:val="22"/>
-          <w:lang w:val="es-AR"/>
-        </w:rPr>
-        <w:t>Followare</w:t>
-      </w:r>
-      <w:proofErr w:type="spellEnd"/>
     </w:p>
     <w:p>
       <w:pPr>
@@ -1701,67 +1746,7 @@
           <w:szCs w:val="20"/>
           <w:lang w:val="es-AR"/>
         </w:rPr>
-        <w:t xml:space="preserve">lo usa durante el día y de forma recurrente a lo largo de la cursada (entre 1 y 5 ingresos diarios a </w:t>
-      </w:r>
-      <w:proofErr w:type="spellStart"/>
-      <w:r>
-        <w:rPr>
-          <w:rFonts w:cs="Arial"/>
-          <w:sz w:val="20"/>
-          <w:szCs w:val="20"/>
-          <w:lang w:val="es-AR"/>
-        </w:rPr>
-        <w:t>MIeL</w:t>
-      </w:r>
-      <w:proofErr w:type="spellEnd"/>
-      <w:r>
-        <w:rPr>
-          <w:rFonts w:cs="Arial"/>
-          <w:sz w:val="20"/>
-          <w:szCs w:val="20"/>
-          <w:lang w:val="es-AR"/>
-        </w:rPr>
-        <w:t xml:space="preserve">, según el relevamiento), en sesiones cortas para chequear si hay novedades, mensajes, material o fechas de una materia; hoy alterna entre </w:t>
-      </w:r>
-      <w:proofErr w:type="spellStart"/>
-      <w:r>
-        <w:rPr>
-          <w:rFonts w:cs="Arial"/>
-          <w:sz w:val="20"/>
-          <w:szCs w:val="20"/>
-          <w:lang w:val="es-AR"/>
-        </w:rPr>
-        <w:t>MIeL</w:t>
-      </w:r>
-      <w:proofErr w:type="spellEnd"/>
-      <w:r>
-        <w:rPr>
-          <w:rFonts w:cs="Arial"/>
-          <w:sz w:val="20"/>
-          <w:szCs w:val="20"/>
-          <w:lang w:val="es-AR"/>
-        </w:rPr>
-        <w:t xml:space="preserve"> e </w:t>
-      </w:r>
-      <w:proofErr w:type="spellStart"/>
-      <w:r>
-        <w:rPr>
-          <w:rFonts w:cs="Arial"/>
-          <w:sz w:val="20"/>
-          <w:szCs w:val="20"/>
-          <w:lang w:val="es-AR"/>
-        </w:rPr>
-        <w:t>Intraconsulta</w:t>
-      </w:r>
-      <w:proofErr w:type="spellEnd"/>
-      <w:r>
-        <w:rPr>
-          <w:rFonts w:cs="Arial"/>
-          <w:sz w:val="20"/>
-          <w:szCs w:val="20"/>
-          <w:lang w:val="es-AR"/>
-        </w:rPr>
-        <w:t xml:space="preserve"> para conseguir esa información.</w:t>
+        <w:t>lo usa durante el día y de forma recurrente a lo largo de la cursada (entre 1 y 5 ingresos diarios a MIeL, según el relevamiento), en sesiones cortas para chequear si hay novedades, mensajes, material o fechas de una materia; hoy alterna entre MIeL e Intraconsulta para conseguir esa información.</w:t>
       </w:r>
     </w:p>
     <w:p>
@@ -1789,27 +1774,7 @@
           <w:szCs w:val="20"/>
           <w:lang w:val="es-AR"/>
         </w:rPr>
-        <w:t xml:space="preserve">satisfacción, porque los tres usuarios se enteraron tarde de algo publicado en </w:t>
-      </w:r>
-      <w:proofErr w:type="spellStart"/>
-      <w:r>
-        <w:rPr>
-          <w:rFonts w:cs="Arial"/>
-          <w:sz w:val="20"/>
-          <w:szCs w:val="20"/>
-          <w:lang w:val="es-AR"/>
-        </w:rPr>
-        <w:t>MIeL</w:t>
-      </w:r>
-      <w:proofErr w:type="spellEnd"/>
-      <w:r>
-        <w:rPr>
-          <w:rFonts w:cs="Arial"/>
-          <w:sz w:val="20"/>
-          <w:szCs w:val="20"/>
-          <w:lang w:val="es-AR"/>
-        </w:rPr>
-        <w:t xml:space="preserve"> y esperan que la app les evite esa frustración; y eficiencia, porque consultan varias veces por día y en distintos sistemas, así que cada paso de más pesa. El equipo descartó explícitamente priorizar facilidad de aprendizaje: sus usuarios ya son expertos en la herramienta que reemplazan.</w:t>
+        <w:t>satisfacción, porque los tres usuarios se enteraron tarde de algo publicado en MIeL y esperan que la app les evite esa frustración; y eficiencia, porque consultan varias veces por día y en distintos sistemas, así que cada paso de más pesa. El equipo descartó explícitamente priorizar facilidad de aprendizaje: sus usuarios ya son expertos en la herramienta que reemplazan.</w:t>
       </w:r>
     </w:p>
     <w:p>
@@ -1837,47 +1802,7 @@
           <w:szCs w:val="20"/>
           <w:lang w:val="es-AR"/>
         </w:rPr>
-        <w:t xml:space="preserve">que centralizar la información académica de </w:t>
-      </w:r>
-      <w:proofErr w:type="spellStart"/>
-      <w:r>
-        <w:rPr>
-          <w:rFonts w:cs="Arial"/>
-          <w:sz w:val="20"/>
-          <w:szCs w:val="20"/>
-          <w:lang w:val="es-AR"/>
-        </w:rPr>
-        <w:t>MIeL</w:t>
-      </w:r>
-      <w:proofErr w:type="spellEnd"/>
-      <w:r>
-        <w:rPr>
-          <w:rFonts w:cs="Arial"/>
-          <w:sz w:val="20"/>
-          <w:szCs w:val="20"/>
-          <w:lang w:val="es-AR"/>
-        </w:rPr>
-        <w:t xml:space="preserve"> e </w:t>
-      </w:r>
-      <w:proofErr w:type="spellStart"/>
-      <w:r>
-        <w:rPr>
-          <w:rFonts w:cs="Arial"/>
-          <w:sz w:val="20"/>
-          <w:szCs w:val="20"/>
-          <w:lang w:val="es-AR"/>
-        </w:rPr>
-        <w:t>Intraconsulta</w:t>
-      </w:r>
-      <w:proofErr w:type="spellEnd"/>
-      <w:r>
-        <w:rPr>
-          <w:rFonts w:cs="Arial"/>
-          <w:sz w:val="20"/>
-          <w:szCs w:val="20"/>
-          <w:lang w:val="es-AR"/>
-        </w:rPr>
-        <w:t xml:space="preserve"> y avisar por notificaciones de las novedades les facilita a los estudiantes el acceso oportuno a la información de sus materias; lo dan por validado si al menos 2 de los 3 usuarios de prueba lo confirman.</w:t>
+        <w:t>que centralizar la información académica de MIeL e Intraconsulta y avisar por notificaciones de las novedades les facilita a los estudiantes el acceso oportuno a la información de sus materias; lo dan por validado si al menos 2 de los 3 usuarios de prueba lo confirman.</w:t>
       </w:r>
     </w:p>
     <w:p>
@@ -1912,61 +1837,7 @@
           <w:sz w:val="20"/>
           <w:lang w:val="es-AR"/>
         </w:rPr>
-        <w:t xml:space="preserve">Recorrimos el </w:t>
-      </w:r>
-      <w:proofErr w:type="spellStart"/>
-      <w:r>
-        <w:rPr>
-          <w:rFonts w:cs="Arial"/>
-          <w:sz w:val="20"/>
-          <w:lang w:val="es-AR"/>
-        </w:rPr>
-        <w:t>wireframe</w:t>
-      </w:r>
-      <w:proofErr w:type="spellEnd"/>
-      <w:r>
-        <w:rPr>
-          <w:rFonts w:cs="Arial"/>
-          <w:sz w:val="20"/>
-          <w:lang w:val="es-AR"/>
-        </w:rPr>
-        <w:t xml:space="preserve"> de </w:t>
-      </w:r>
-      <w:proofErr w:type="spellStart"/>
-      <w:r>
-        <w:rPr>
-          <w:rFonts w:cs="Arial"/>
-          <w:sz w:val="20"/>
-          <w:lang w:val="es-AR"/>
-        </w:rPr>
-        <w:t>Followare</w:t>
-      </w:r>
-      <w:proofErr w:type="spellEnd"/>
-      <w:r>
-        <w:rPr>
-          <w:rFonts w:cs="Arial"/>
-          <w:sz w:val="20"/>
-          <w:lang w:val="es-AR"/>
-        </w:rPr>
-        <w:t xml:space="preserve"> siguiendo el flujo principal que el propio material declara —notificación, bandeja de novedades, panel de detalle, materias en curso, contenidos de una materia y plan de correlatividades— y anotamos cada problema que encontramos. Listamos sólo las heurísticas que consideramos incumplidas: las que el diseño resuelve bien no las forzamos a entrar en la tabla. La severidad va de 1 a 4 y está justificada contra el perfil del punto 1: un estudiante experto en </w:t>
-      </w:r>
-      <w:proofErr w:type="spellStart"/>
-      <w:r>
-        <w:rPr>
-          <w:rFonts w:cs="Arial"/>
-          <w:sz w:val="20"/>
-          <w:lang w:val="es-AR"/>
-        </w:rPr>
-        <w:t>MIeL</w:t>
-      </w:r>
-      <w:proofErr w:type="spellEnd"/>
-      <w:r>
-        <w:rPr>
-          <w:rFonts w:cs="Arial"/>
-          <w:sz w:val="20"/>
-          <w:lang w:val="es-AR"/>
-        </w:rPr>
-        <w:t>, que entra varias veces por día en sesiones cortas y para el que el equipo priorizó satisfacción y eficiencia, no facilidad de aprendizaje.</w:t>
+        <w:t>Recorrimos el wireframe de Followare siguiendo el flujo principal que el propio material declara —notificación, bandeja de novedades, panel de detalle, materias en curso, contenidos de una materia y plan de correlatividades— y anotamos cada problema que encontramos. Listamos sólo las heurísticas que consideramos incumplidas: las que el diseño resuelve bien no las forzamos a entrar en la tabla. La severidad va de 1 a 4 y está justificada contra el perfil del punto 1: un estudiante experto en MIeL, que entra varias veces por día en sesiones cortas y para el que el equipo priorizó satisfacción y eficiencia, no facilidad de aprendizaje.</w:t>
       </w:r>
     </w:p>
     <w:p>
@@ -2790,25 +2661,7 @@
                 <w:sz w:val="17"/>
                 <w:lang w:val="es-AR"/>
               </w:rPr>
-              <w:t>Algunos nombres aparecen abreviados o cortados, como “</w:t>
-            </w:r>
-            <w:proofErr w:type="spellStart"/>
-            <w:r>
-              <w:rPr>
-                <w:rFonts w:cs="Arial"/>
-                <w:sz w:val="17"/>
-                <w:lang w:val="es-AR"/>
-              </w:rPr>
-              <w:t>Cfg</w:t>
-            </w:r>
-            <w:proofErr w:type="spellEnd"/>
-            <w:r>
-              <w:rPr>
-                <w:rFonts w:cs="Arial"/>
-                <w:sz w:val="17"/>
-                <w:lang w:val="es-AR"/>
-              </w:rPr>
-              <w:t>” e “Intra…”, por lo que no queda claro qué opción representan.</w:t>
+              <w:t>Algunos nombres aparecen abreviados o cortados, como “Cfg” e “Intra…”, por lo que no queda claro qué opción representan.</w:t>
             </w:r>
           </w:p>
         </w:tc>
@@ -2862,25 +2715,7 @@
                 <w:sz w:val="17"/>
                 <w:lang w:val="es-AR"/>
               </w:rPr>
-              <w:t>Usar “Ajustes” o un ícono conocido y mostrar “</w:t>
-            </w:r>
-            <w:proofErr w:type="spellStart"/>
-            <w:r>
-              <w:rPr>
-                <w:rFonts w:cs="Arial"/>
-                <w:sz w:val="17"/>
-                <w:lang w:val="es-AR"/>
-              </w:rPr>
-              <w:t>Intraconsulta</w:t>
-            </w:r>
-            <w:proofErr w:type="spellEnd"/>
-            <w:r>
-              <w:rPr>
-                <w:rFonts w:cs="Arial"/>
-                <w:sz w:val="17"/>
-                <w:lang w:val="es-AR"/>
-              </w:rPr>
-              <w:t>” completo.</w:t>
+              <w:t>Usar “Ajustes” o un ícono conocido y mostrar “Intraconsulta” completo.</w:t>
             </w:r>
           </w:p>
         </w:tc>
@@ -3186,29 +3021,7 @@
           <w:sz w:val="22"/>
           <w:lang w:val="es-AR"/>
         </w:rPr>
-        <w:t xml:space="preserve">¿El diseño sirve a los atributos que </w:t>
-      </w:r>
-      <w:proofErr w:type="spellStart"/>
-      <w:r>
-        <w:rPr>
-          <w:rFonts w:cs="Arial"/>
-          <w:b/>
-          <w:color w:val="1F4E79"/>
-          <w:sz w:val="22"/>
-          <w:lang w:val="es-AR"/>
-        </w:rPr>
-        <w:t>Followare</w:t>
-      </w:r>
-      <w:proofErr w:type="spellEnd"/>
-      <w:r>
-        <w:rPr>
-          <w:rFonts w:cs="Arial"/>
-          <w:b/>
-          <w:color w:val="1F4E79"/>
-          <w:sz w:val="22"/>
-          <w:lang w:val="es-AR"/>
-        </w:rPr>
-        <w:t xml:space="preserve"> priorizó en su TP3?</w:t>
+        <w:t>¿El diseño sirve a los atributos que Followare priorizó en su TP3?</w:t>
       </w:r>
     </w:p>
     <w:p>
@@ -3234,25 +3047,7 @@
           <w:sz w:val="20"/>
           <w:lang w:val="es-AR"/>
         </w:rPr>
-        <w:t xml:space="preserve">La eficiencia está construida en la estructura y se nota: el </w:t>
-      </w:r>
-      <w:proofErr w:type="spellStart"/>
-      <w:r>
-        <w:rPr>
-          <w:rFonts w:cs="Arial"/>
-          <w:sz w:val="20"/>
-          <w:lang w:val="es-AR"/>
-        </w:rPr>
-        <w:t>deep</w:t>
-      </w:r>
-      <w:proofErr w:type="spellEnd"/>
-      <w:r>
-        <w:rPr>
-          <w:rFonts w:cs="Arial"/>
-          <w:sz w:val="20"/>
-          <w:lang w:val="es-AR"/>
-        </w:rPr>
-        <w:t xml:space="preserve"> link lleva de la notificación al contenido sin pasar por un menú, el Home es directamente la bandeja, las acciones viven en la fila, el detalle es un panel que no saca al usuario de la lista, y toda la app tiene dos niveles de profundidad y tres secciones fijas. Desde la notificación hasta el material hay dos toques, o uno si se descarga desde la propia notificación. Para un usuario que entra entre una y cinco veces por día, esa economía de pasos es la decisión correcta y está bien ejecutada.</w:t>
+        <w:t>La eficiencia está construida en la estructura y se nota: el deep link lleva de la notificación al contenido sin pasar por un menú, el Home es directamente la bandeja, las acciones viven en la fila, el detalle es un panel que no saca al usuario de la lista, y toda la app tiene dos niveles de profundidad y tres secciones fijas. Desde la notificación hasta el material hay dos toques, o uno si se descarga desde la propia notificación. Para un usuario que entra entre una y cinco veces por día, esa economía de pasos es la decisión correcta y está bien ejecutada.</w:t>
       </w:r>
     </w:p>
     <w:p>
@@ -3300,43 +3095,7 @@
           <w:sz w:val="20"/>
           <w:lang w:val="es-AR"/>
         </w:rPr>
-        <w:t xml:space="preserve">El equipo la priorizó porque sus tres usuarios se enteraron tarde de algo publicado en </w:t>
-      </w:r>
-      <w:proofErr w:type="spellStart"/>
-      <w:r>
-        <w:rPr>
-          <w:rFonts w:cs="Arial"/>
-          <w:sz w:val="20"/>
-          <w:lang w:val="es-AR"/>
-        </w:rPr>
-        <w:t>MIeL</w:t>
-      </w:r>
-      <w:proofErr w:type="spellEnd"/>
-      <w:r>
-        <w:rPr>
-          <w:rFonts w:cs="Arial"/>
-          <w:sz w:val="20"/>
-          <w:lang w:val="es-AR"/>
-        </w:rPr>
-        <w:t xml:space="preserve"> y esperan que la app les evite esa frustración, así que todo se apoya en confiar en el aviso. El contador que muestra “0 sin ver” en la bandeja y “2 sin ver” en Materias ataca esa confianza en el punto exacto donde se construye: si el número no cierra, el usuario vuelve a abrir </w:t>
-      </w:r>
-      <w:proofErr w:type="spellStart"/>
-      <w:r>
-        <w:rPr>
-          <w:rFonts w:cs="Arial"/>
-          <w:sz w:val="20"/>
-          <w:lang w:val="es-AR"/>
-        </w:rPr>
-        <w:t>MIeL</w:t>
-      </w:r>
-      <w:proofErr w:type="spellEnd"/>
-      <w:r>
-        <w:rPr>
-          <w:rFonts w:cs="Arial"/>
-          <w:sz w:val="20"/>
-          <w:lang w:val="es-AR"/>
-        </w:rPr>
-        <w:t xml:space="preserve"> para chequear, y la app no le saca la frustración que la hipótesis promete sacarle. La ausencia de estados de error empuja en la misma dirección.</w:t>
+        <w:t>El equipo la priorizó porque sus tres usuarios se enteraron tarde de algo publicado en MIeL y esperan que la app les evite esa frustración, así que todo se apoya en confiar en el aviso. El contador que muestra “0 sin ver” en la bandeja y “2 sin ver” en Materias ataca esa confianza en el punto exacto donde se construye: si el número no cierra, el usuario vuelve a abrir MIeL para chequear, y la app no le saca la frustración que la hipótesis promete sacarle. La ausencia de estados de error empuja en la misma dirección.</w:t>
       </w:r>
     </w:p>
     <w:p>
@@ -3357,43 +3116,7 @@
           <w:lang w:val="es-AR"/>
         </w:rPr>
         <w:lastRenderedPageBreak/>
-        <w:t>Con la facilidad de aprendizaje, en cambio, el diseño es coherente con lo que el equipo declaró. “</w:t>
-      </w:r>
-      <w:proofErr w:type="spellStart"/>
-      <w:r>
-        <w:rPr>
-          <w:rFonts w:cs="Arial"/>
-          <w:sz w:val="20"/>
-          <w:lang w:val="es-AR"/>
-        </w:rPr>
-        <w:t>Cfg</w:t>
-      </w:r>
-      <w:proofErr w:type="spellEnd"/>
-      <w:r>
-        <w:rPr>
-          <w:rFonts w:cs="Arial"/>
-          <w:sz w:val="20"/>
-          <w:lang w:val="es-AR"/>
-        </w:rPr>
-        <w:t xml:space="preserve">”, el chip “Intra…” y los cuadrados sin leyenda del plan son problemas de primer uso, y </w:t>
-      </w:r>
-      <w:proofErr w:type="spellStart"/>
-      <w:r>
-        <w:rPr>
-          <w:rFonts w:cs="Arial"/>
-          <w:sz w:val="20"/>
-          <w:lang w:val="es-AR"/>
-        </w:rPr>
-        <w:t>Followare</w:t>
-      </w:r>
-      <w:proofErr w:type="spellEnd"/>
-      <w:r>
-        <w:rPr>
-          <w:rFonts w:cs="Arial"/>
-          <w:sz w:val="20"/>
-          <w:lang w:val="es-AR"/>
-        </w:rPr>
-        <w:t xml:space="preserve"> descartó explícitamente ese atributo porque sus usuarios ya son expertos en la herramienta que reemplaza. Por eso los puntuamos en 2 y no más alto: son coherentes con la prioridad elegida, no contradicciones. La única salvedad es el </w:t>
+        <w:t xml:space="preserve">Con la facilidad de aprendizaje, en cambio, el diseño es coherente con lo que el equipo declaró. “Cfg”, el chip “Intra…” y los cuadrados sin leyenda del plan son problemas de primer uso, y Followare descartó explícitamente ese atributo porque sus usuarios ya son expertos en la herramienta que reemplaza. Por eso los puntuamos en 2 y no más alto: son coherentes con la prioridad elegida, no contradicciones. La única salvedad es el </w:t>
       </w:r>
       <w:r>
         <w:rPr>
@@ -3402,27 +3125,7 @@
           <w:szCs w:val="20"/>
           <w:lang w:val="es-AR"/>
         </w:rPr>
-        <w:t xml:space="preserve">plan de correlatividades, que no reemplaza una pantalla de </w:t>
-      </w:r>
-      <w:proofErr w:type="spellStart"/>
-      <w:r>
-        <w:rPr>
-          <w:rFonts w:cs="Arial"/>
-          <w:sz w:val="20"/>
-          <w:szCs w:val="20"/>
-          <w:lang w:val="es-AR"/>
-        </w:rPr>
-        <w:t>MIeL</w:t>
-      </w:r>
-      <w:proofErr w:type="spellEnd"/>
-      <w:r>
-        <w:rPr>
-          <w:rFonts w:cs="Arial"/>
-          <w:sz w:val="20"/>
-          <w:szCs w:val="20"/>
-          <w:lang w:val="es-AR"/>
-        </w:rPr>
-        <w:t xml:space="preserve"> sino un PDF descargado, y es donde el usuario menos puede apoyarse en lo que ya sabe.</w:t>
+        <w:t>plan de correlatividades, que no reemplaza una pantalla de MIeL sino un PDF descargado, y es donde el usuario menos puede apoyarse en lo que ya sabe.</w:t>
       </w:r>
       <w:bookmarkStart w:id="2" w:name="_TocPoint4"/>
     </w:p>
@@ -3519,7 +3222,6 @@
             <w:pPr>
               <w:spacing w:after="0"/>
             </w:pPr>
-            <w:proofErr w:type="spellStart"/>
             <w:r>
               <w:rPr>
                 <w:b/>
@@ -3528,7 +3230,6 @@
               </w:rPr>
               <w:t>Comparación</w:t>
             </w:r>
-            <w:proofErr w:type="spellEnd"/>
           </w:p>
         </w:tc>
         <w:tc>
@@ -3554,7 +3255,6 @@
               <w:spacing w:after="0"/>
               <w:jc w:val="center"/>
             </w:pPr>
-            <w:proofErr w:type="spellStart"/>
             <w:r>
               <w:rPr>
                 <w:b/>
@@ -3563,7 +3263,6 @@
               </w:rPr>
               <w:t>Cantidad</w:t>
             </w:r>
-            <w:proofErr w:type="spellEnd"/>
           </w:p>
         </w:tc>
         <w:tc>
@@ -3588,7 +3287,6 @@
             <w:pPr>
               <w:spacing w:after="0"/>
             </w:pPr>
-            <w:proofErr w:type="spellStart"/>
             <w:r>
               <w:rPr>
                 <w:b/>
@@ -3597,7 +3295,6 @@
               </w:rPr>
               <w:t>Ejemplos</w:t>
             </w:r>
-            <w:proofErr w:type="spellEnd"/>
           </w:p>
         </w:tc>
       </w:tr>
@@ -3698,23 +3395,7 @@
                 <w:sz w:val="18"/>
                 <w:lang w:val="es-AR"/>
               </w:rPr>
-              <w:t>Falta de confirmación en algunas descargas (equipo 1 / IA 6); contador de no leídos inconsistente entre Novedades y Materias (2 / 2); retorno a Materias en lugar de volver a la novedad y conservar la posición (3 / 7); abreviaturas poco claras, como “</w:t>
-            </w:r>
-            <w:proofErr w:type="spellStart"/>
-            <w:r>
-              <w:rPr>
-                <w:sz w:val="18"/>
-                <w:lang w:val="es-AR"/>
-              </w:rPr>
-              <w:t>Cfg</w:t>
-            </w:r>
-            <w:proofErr w:type="spellEnd"/>
-            <w:r>
-              <w:rPr>
-                <w:sz w:val="18"/>
-                <w:lang w:val="es-AR"/>
-              </w:rPr>
-              <w:t xml:space="preserve">” e “Intra…” </w:t>
+              <w:t xml:space="preserve">Falta de confirmación en algunas descargas (equipo 1 / IA 6); contador de no leídos inconsistente entre Novedades y Materias (2 / 2); retorno a Materias en lugar de volver a la novedad y conservar la posición (3 / 7); abreviaturas poco claras, como “Cfg” e “Intra…” </w:t>
             </w:r>
             <w:r>
               <w:rPr>
@@ -4257,20 +3938,8 @@
           <w:sz w:val="20"/>
           <w:lang w:val="es-AR"/>
         </w:rPr>
-        <w:t xml:space="preserve">Controles sin interacción en el </w:t>
+        <w:t>Controles sin interacción en el wireframe</w:t>
       </w:r>
-      <w:proofErr w:type="spellStart"/>
-      <w:r>
-        <w:rPr>
-          <w:rFonts w:cs="Arial"/>
-          <w:b/>
-          <w:bCs/>
-          <w:sz w:val="20"/>
-          <w:lang w:val="es-AR"/>
-        </w:rPr>
-        <w:t>wireframe</w:t>
-      </w:r>
-      <w:proofErr w:type="spellEnd"/>
       <w:r>
         <w:rPr>
           <w:rFonts w:cs="Arial"/>
@@ -4285,43 +3954,7 @@
           <w:sz w:val="20"/>
           <w:lang w:val="es-AR"/>
         </w:rPr>
-        <w:t> La IA marcó como problema que los filtros, “Buscar” y “</w:t>
-      </w:r>
-      <w:proofErr w:type="spellStart"/>
-      <w:r>
-        <w:rPr>
-          <w:rFonts w:cs="Arial"/>
-          <w:sz w:val="20"/>
-          <w:lang w:val="es-AR"/>
-        </w:rPr>
-        <w:t>Cfg</w:t>
-      </w:r>
-      <w:proofErr w:type="spellEnd"/>
-      <w:r>
-        <w:rPr>
-          <w:rFonts w:cs="Arial"/>
-          <w:sz w:val="20"/>
-          <w:lang w:val="es-AR"/>
-        </w:rPr>
-        <w:t xml:space="preserve">” no funcionaran. Decidimos no considerarlo un problema porque estamos evaluando un </w:t>
-      </w:r>
-      <w:proofErr w:type="spellStart"/>
-      <w:r>
-        <w:rPr>
-          <w:rFonts w:cs="Arial"/>
-          <w:sz w:val="20"/>
-          <w:lang w:val="es-AR"/>
-        </w:rPr>
-        <w:t>wireframe</w:t>
-      </w:r>
-      <w:proofErr w:type="spellEnd"/>
-      <w:r>
-        <w:rPr>
-          <w:rFonts w:cs="Arial"/>
-          <w:sz w:val="20"/>
-          <w:lang w:val="es-AR"/>
-        </w:rPr>
-        <w:t xml:space="preserve"> y no un sistema terminado. El objetivo en esta instancia es representar las pantallas y los recorridos principales, por lo que no esperamos que todos los controles estén implementados.</w:t>
+        <w:t> La IA marcó como problema que los filtros, “Buscar” y “Cfg” no funcionaran. Decidimos no considerarlo un problema porque estamos evaluando un wireframe y no un sistema terminado. El objetivo en esta instancia es representar las pantallas y los recorridos principales, por lo que no esperamos que todos los controles estén implementados.</w:t>
       </w:r>
     </w:p>
     <w:p>
@@ -4387,25 +4020,7 @@
           <w:sz w:val="20"/>
           <w:lang w:val="es-AR"/>
         </w:rPr>
-        <w:t xml:space="preserve">Decidimos descartarlo porque los usuarios definidos en el </w:t>
-      </w:r>
-      <w:proofErr w:type="spellStart"/>
-      <w:r>
-        <w:rPr>
-          <w:rFonts w:cs="Arial"/>
-          <w:sz w:val="20"/>
-          <w:lang w:val="es-AR"/>
-        </w:rPr>
-        <w:t>brief</w:t>
-      </w:r>
-      <w:proofErr w:type="spellEnd"/>
-      <w:r>
-        <w:rPr>
-          <w:rFonts w:cs="Arial"/>
-          <w:sz w:val="20"/>
-          <w:lang w:val="es-AR"/>
-        </w:rPr>
-        <w:t xml:space="preserve"> tienen buen manejo de tecnología y utilizan MIEL varias veces por día. Además, el contador de novedades “sin ver” ayuda a entender qué representa ese indicador y existe la opción de volver a marcar una novedad como no leída.</w:t>
+        <w:t>Decidimos descartarlo porque los usuarios definidos en el brief tienen buen manejo de tecnología y utilizan MIEL varias veces por día. Además, el contador de novedades “sin ver” ayuda a entender qué representa ese indicador y existe la opción de volver a marcar una novedad como no leída.</w:t>
       </w:r>
     </w:p>
     <w:p>
@@ -4549,34 +4164,14 @@
               <w:spacing w:after="0"/>
               <w:jc w:val="center"/>
             </w:pPr>
-            <w:proofErr w:type="spellStart"/>
             <w:r>
               <w:rPr>
                 <w:b/>
                 <w:color w:val="FFFFFF"/>
                 <w:sz w:val="17"/>
               </w:rPr>
-              <w:t>Heurística</w:t>
+              <w:t>Heurística incumplida</w:t>
             </w:r>
-            <w:proofErr w:type="spellEnd"/>
-            <w:r>
-              <w:rPr>
-                <w:b/>
-                <w:color w:val="FFFFFF"/>
-                <w:sz w:val="17"/>
-              </w:rPr>
-              <w:t xml:space="preserve"> </w:t>
-            </w:r>
-            <w:proofErr w:type="spellStart"/>
-            <w:r>
-              <w:rPr>
-                <w:b/>
-                <w:color w:val="FFFFFF"/>
-                <w:sz w:val="17"/>
-              </w:rPr>
-              <w:t>incumplida</w:t>
-            </w:r>
-            <w:proofErr w:type="spellEnd"/>
           </w:p>
         </w:tc>
         <w:tc>
@@ -4602,34 +4197,14 @@
               <w:spacing w:after="0"/>
               <w:jc w:val="center"/>
             </w:pPr>
-            <w:proofErr w:type="spellStart"/>
             <w:r>
               <w:rPr>
                 <w:b/>
                 <w:color w:val="FFFFFF"/>
                 <w:sz w:val="17"/>
               </w:rPr>
-              <w:t>Descripción</w:t>
+              <w:t>Descripción del problema</w:t>
             </w:r>
-            <w:proofErr w:type="spellEnd"/>
-            <w:r>
-              <w:rPr>
-                <w:b/>
-                <w:color w:val="FFFFFF"/>
-                <w:sz w:val="17"/>
-              </w:rPr>
-              <w:t xml:space="preserve"> del </w:t>
-            </w:r>
-            <w:proofErr w:type="spellStart"/>
-            <w:r>
-              <w:rPr>
-                <w:b/>
-                <w:color w:val="FFFFFF"/>
-                <w:sz w:val="17"/>
-              </w:rPr>
-              <w:t>problema</w:t>
-            </w:r>
-            <w:proofErr w:type="spellEnd"/>
           </w:p>
         </w:tc>
         <w:tc>
@@ -4655,23 +4230,13 @@
               <w:spacing w:after="0"/>
               <w:jc w:val="center"/>
             </w:pPr>
-            <w:proofErr w:type="spellStart"/>
             <w:r>
               <w:rPr>
                 <w:b/>
                 <w:color w:val="FFFFFF"/>
                 <w:sz w:val="17"/>
               </w:rPr>
-              <w:t>Severidad</w:t>
-            </w:r>
-            <w:proofErr w:type="spellEnd"/>
-            <w:r>
-              <w:rPr>
-                <w:b/>
-                <w:color w:val="FFFFFF"/>
-                <w:sz w:val="17"/>
-              </w:rPr>
-              <w:t xml:space="preserve"> (1-4)</w:t>
+              <w:t>Severidad (1-4)</w:t>
             </w:r>
           </w:p>
         </w:tc>
@@ -4698,34 +4263,14 @@
               <w:spacing w:after="0"/>
               <w:jc w:val="center"/>
             </w:pPr>
-            <w:proofErr w:type="spellStart"/>
             <w:r>
               <w:rPr>
                 <w:b/>
                 <w:color w:val="FFFFFF"/>
                 <w:sz w:val="17"/>
               </w:rPr>
-              <w:t>Mejora</w:t>
+              <w:t>Mejora sugerida</w:t>
             </w:r>
-            <w:proofErr w:type="spellEnd"/>
-            <w:r>
-              <w:rPr>
-                <w:b/>
-                <w:color w:val="FFFFFF"/>
-                <w:sz w:val="17"/>
-              </w:rPr>
-              <w:t xml:space="preserve"> </w:t>
-            </w:r>
-            <w:proofErr w:type="spellStart"/>
-            <w:r>
-              <w:rPr>
-                <w:b/>
-                <w:color w:val="FFFFFF"/>
-                <w:sz w:val="17"/>
-              </w:rPr>
-              <w:t>sugerida</w:t>
-            </w:r>
-            <w:proofErr w:type="spellEnd"/>
           </w:p>
         </w:tc>
       </w:tr>
@@ -4963,31 +4508,13 @@
             <w:pPr>
               <w:spacing w:after="0" w:line="240" w:lineRule="auto"/>
             </w:pPr>
-            <w:proofErr w:type="spellStart"/>
             <w:r>
               <w:rPr>
                 <w:b/>
                 <w:sz w:val="16"/>
               </w:rPr>
-              <w:t>Coherencia</w:t>
+              <w:t>Coherencia y estándares</w:t>
             </w:r>
-            <w:proofErr w:type="spellEnd"/>
-            <w:r>
-              <w:rPr>
-                <w:b/>
-                <w:sz w:val="16"/>
-              </w:rPr>
-              <w:t xml:space="preserve"> y </w:t>
-            </w:r>
-            <w:proofErr w:type="spellStart"/>
-            <w:r>
-              <w:rPr>
-                <w:b/>
-                <w:sz w:val="16"/>
-              </w:rPr>
-              <w:t>estándares</w:t>
-            </w:r>
-            <w:proofErr w:type="spellEnd"/>
           </w:p>
         </w:tc>
         <w:tc>
@@ -5327,31 +4854,13 @@
             <w:pPr>
               <w:spacing w:after="0" w:line="240" w:lineRule="auto"/>
             </w:pPr>
-            <w:proofErr w:type="spellStart"/>
             <w:r>
               <w:rPr>
                 <w:b/>
                 <w:sz w:val="16"/>
               </w:rPr>
-              <w:t>Coherencia</w:t>
+              <w:t>Coherencia y estándares</w:t>
             </w:r>
-            <w:proofErr w:type="spellEnd"/>
-            <w:r>
-              <w:rPr>
-                <w:b/>
-                <w:sz w:val="16"/>
-              </w:rPr>
-              <w:t xml:space="preserve"> y </w:t>
-            </w:r>
-            <w:proofErr w:type="spellStart"/>
-            <w:r>
-              <w:rPr>
-                <w:b/>
-                <w:sz w:val="16"/>
-              </w:rPr>
-              <w:t>estándares</w:t>
-            </w:r>
-            <w:proofErr w:type="spellEnd"/>
           </w:p>
         </w:tc>
         <w:tc>
@@ -5516,31 +5025,13 @@
             <w:pPr>
               <w:spacing w:after="0" w:line="240" w:lineRule="auto"/>
             </w:pPr>
-            <w:proofErr w:type="spellStart"/>
             <w:r>
               <w:rPr>
                 <w:b/>
                 <w:sz w:val="16"/>
               </w:rPr>
-              <w:t>Coherencia</w:t>
+              <w:t>Coherencia y estándares</w:t>
             </w:r>
-            <w:proofErr w:type="spellEnd"/>
-            <w:r>
-              <w:rPr>
-                <w:b/>
-                <w:sz w:val="16"/>
-              </w:rPr>
-              <w:t xml:space="preserve"> y </w:t>
-            </w:r>
-            <w:proofErr w:type="spellStart"/>
-            <w:r>
-              <w:rPr>
-                <w:b/>
-                <w:sz w:val="16"/>
-              </w:rPr>
-              <w:t>estándares</w:t>
-            </w:r>
-            <w:proofErr w:type="spellEnd"/>
           </w:p>
         </w:tc>
         <w:tc>
@@ -5748,23 +5239,7 @@
                 <w:sz w:val="16"/>
                 <w:lang w:val="es-AR"/>
               </w:rPr>
-              <w:t>Algunos nombres aparecen abreviados o cortados, como “</w:t>
-            </w:r>
-            <w:proofErr w:type="spellStart"/>
-            <w:r>
-              <w:rPr>
-                <w:sz w:val="16"/>
-                <w:lang w:val="es-AR"/>
-              </w:rPr>
-              <w:t>Cfg</w:t>
-            </w:r>
-            <w:proofErr w:type="spellEnd"/>
-            <w:r>
-              <w:rPr>
-                <w:sz w:val="16"/>
-                <w:lang w:val="es-AR"/>
-              </w:rPr>
-              <w:t>” e “Intra…”, por lo que el usuario tiene que interpretar a qué opción hacen referencia.</w:t>
+              <w:t>Algunos nombres aparecen abreviados o cortados, como “Cfg” e “Intra…”, por lo que el usuario tiene que interpretar a qué opción hacen referencia.</w:t>
             </w:r>
           </w:p>
         </w:tc>
@@ -5832,23 +5307,7 @@
                 <w:sz w:val="16"/>
                 <w:lang w:val="es-AR"/>
               </w:rPr>
-              <w:t>Mostrar los nombres completos, como “Configuración” e “</w:t>
-            </w:r>
-            <w:proofErr w:type="spellStart"/>
-            <w:r>
-              <w:rPr>
-                <w:sz w:val="16"/>
-                <w:lang w:val="es-AR"/>
-              </w:rPr>
-              <w:t>Intraconsulta</w:t>
-            </w:r>
-            <w:proofErr w:type="spellEnd"/>
-            <w:r>
-              <w:rPr>
-                <w:sz w:val="16"/>
-                <w:lang w:val="es-AR"/>
-              </w:rPr>
-              <w:t>”, o acompañarlos con un ícono conocido.</w:t>
+              <w:t>Mostrar los nombres completos, como “Configuración” e “Intraconsulta”, o acompañarlos con un ícono conocido.</w:t>
             </w:r>
           </w:p>
         </w:tc>
@@ -6097,23 +5556,7 @@
           <w:bCs/>
           <w:lang w:val="es-AR"/>
         </w:rPr>
-        <w:t xml:space="preserve">La propuesta tiene una buena base porque reúne la información y permite revisar las novedades de forma rápida. Corregir los contadores y los destinos equivocados ayudaría a que el usuario no tenga que volver a MIeL para comprobar la información. De todas formas, este atributo debería validarse con usuarios, ya que no puede asegurarse sólo a partir del </w:t>
-      </w:r>
-      <w:proofErr w:type="spellStart"/>
-      <w:r>
-        <w:rPr>
-          <w:bCs/>
-          <w:lang w:val="es-AR"/>
-        </w:rPr>
-        <w:t>wireframe</w:t>
-      </w:r>
-      <w:proofErr w:type="spellEnd"/>
-      <w:r>
-        <w:rPr>
-          <w:bCs/>
-          <w:lang w:val="es-AR"/>
-        </w:rPr>
-        <w:t>.</w:t>
+        <w:t>La propuesta tiene una buena base porque reúne la información y permite revisar las novedades de forma rápida. Corregir los contadores y los destinos equivocados ayudaría a que el usuario no tenga que volver a MIeL para comprobar la información. De todas formas, este atributo debería validarse con usuarios, ya que no puede asegurarse sólo a partir del wireframe.</w:t>
       </w:r>
     </w:p>
     <w:p>
@@ -6144,57 +5587,13 @@
           <w:b/>
           <w:lang w:val="es-AR"/>
         </w:rPr>
-        <w:t xml:space="preserve">Controles sin interacción en el </w:t>
-      </w:r>
-      <w:proofErr w:type="spellStart"/>
-      <w:r>
-        <w:rPr>
-          <w:b/>
-          <w:lang w:val="es-AR"/>
-        </w:rPr>
-        <w:t>wireframe</w:t>
-      </w:r>
-      <w:proofErr w:type="spellEnd"/>
-      <w:r>
-        <w:rPr>
-          <w:b/>
-          <w:lang w:val="es-AR"/>
-        </w:rPr>
-        <w:t xml:space="preserve">. </w:t>
+        <w:t xml:space="preserve">Controles sin interacción en el wireframe. </w:t>
       </w:r>
       <w:r>
         <w:rPr>
           <w:lang w:val="es-AR"/>
         </w:rPr>
-        <w:t>La IA marcó como problema que los filtros, “Buscar” y “</w:t>
-      </w:r>
-      <w:proofErr w:type="spellStart"/>
-      <w:r>
-        <w:rPr>
-          <w:lang w:val="es-AR"/>
-        </w:rPr>
-        <w:t>Cfg</w:t>
-      </w:r>
-      <w:proofErr w:type="spellEnd"/>
-      <w:r>
-        <w:rPr>
-          <w:lang w:val="es-AR"/>
-        </w:rPr>
-        <w:t xml:space="preserve">” no respondieran. Lo descartamos porque el artefacto evaluado es un </w:t>
-      </w:r>
-      <w:proofErr w:type="spellStart"/>
-      <w:r>
-        <w:rPr>
-          <w:lang w:val="es-AR"/>
-        </w:rPr>
-        <w:t>wireframe</w:t>
-      </w:r>
-      <w:proofErr w:type="spellEnd"/>
-      <w:r>
-        <w:rPr>
-          <w:lang w:val="es-AR"/>
-        </w:rPr>
-        <w:t>: comunica estructura y recorridos, pero no supone que todos los controles estén implementados. El hallazgo pasaría a ser válido si esos controles continuaran inactivos en el MVP funcional.</w:t>
+        <w:t>La IA marcó como problema que los filtros, “Buscar” y “Cfg” no respondieran. Lo descartamos porque el artefacto evaluado es un wireframe: comunica estructura y recorridos, pero no supone que todos los controles estén implementados. El hallazgo pasaría a ser válido si esos controles continuaran inactivos en el MVP funcional.</w:t>
       </w:r>
     </w:p>
     <w:p>
@@ -6217,35 +5616,7 @@
         <w:rPr>
           <w:lang w:val="es-AR"/>
         </w:rPr>
-        <w:t xml:space="preserve">La IA propuso explicar el punto azul y avisar cada vez que una novedad se marca como leída. El </w:t>
-      </w:r>
-      <w:proofErr w:type="spellStart"/>
-      <w:r>
-        <w:rPr>
-          <w:lang w:val="es-AR"/>
-        </w:rPr>
-        <w:t>brief</w:t>
-      </w:r>
-      <w:proofErr w:type="spellEnd"/>
-      <w:r>
-        <w:rPr>
-          <w:lang w:val="es-AR"/>
-        </w:rPr>
-        <w:t xml:space="preserve"> describe usuarios con buen manejo de tecnología que consultan </w:t>
-      </w:r>
-      <w:proofErr w:type="spellStart"/>
-      <w:r>
-        <w:rPr>
-          <w:lang w:val="es-AR"/>
-        </w:rPr>
-        <w:t>MIeL</w:t>
-      </w:r>
-      <w:proofErr w:type="spellEnd"/>
-      <w:r>
-        <w:rPr>
-          <w:lang w:val="es-AR"/>
-        </w:rPr>
-        <w:t xml:space="preserve"> varias veces por día y no prioriza la facilidad de aprendizaje. El contador “sin ver” aporta contexto y “Marcar como no leída” permite revertir el cambio. Una explicación o confirmación en cada apertura agregaría información a una consulta breve sin responder a un problema observado.</w:t>
+        <w:t>La IA propuso explicar el punto azul y avisar cada vez que una novedad se marca como leída. El brief describe usuarios con buen manejo de tecnología que consultan MIeL varias veces por día y no prioriza la facilidad de aprendizaje. El contador “sin ver” aporta contexto y “Marcar como no leída” permite revertir el cambio. Una explicación o confirmación en cada apertura agregaría información a una consulta breve sin responder a un problema observado.</w:t>
       </w:r>
     </w:p>
     <w:p>
@@ -6272,6 +5643,141 @@
         <w:t xml:space="preserve"> Lo tomamos como falso positivo porque, en este contexto, se entiende que el botón descarga todos los archivos de la unidad. Podría mejorarse el rótulo a “Descargar los 2 archivos”, pero no lo consideraríamos un problema de usabilidad para este perfil.</w:t>
       </w:r>
     </w:p>
+    <w:p>
+      <w:pPr>
+        <w:pStyle w:val="Ttulo1"/>
+        <w:pageBreakBefore/>
+        <w:rPr>
+          <w:lang w:val="es-AR"/>
+        </w:rPr>
+      </w:pPr>
+      <w:bookmarkStart w:id="4" w:name="_TocPoint6"/>
+      <w:r>
+        <w:rPr>
+          <w:lang w:val="es-AR"/>
+        </w:rPr>
+        <w:lastRenderedPageBreak/>
+        <w:t>6. Respuesta del equipo evaluado</w:t>
+      </w:r>
+      <w:bookmarkEnd w:id="4"/>
+    </w:p>
+    <w:p>
+      <w:pPr>
+        <w:spacing w:after="100" w:line="247" w:lineRule="auto"/>
+        <w:jc w:val="both"/>
+        <w:rPr>
+          <w:bCs/>
+          <w:lang w:val="es-AR"/>
+        </w:rPr>
+      </w:pPr>
+      <w:r>
+        <w:rPr>
+          <w:b/>
+          <w:lang w:val="es-AR"/>
+        </w:rPr>
+        <w:t xml:space="preserve">Problemas que aceptamos y corregiremos en el TP5. </w:t>
+      </w:r>
+      <w:r>
+        <w:rPr>
+          <w:lang w:val="es-AR"/>
+        </w:rPr>
+        <w:t>Origen y llegada (1, 2 y 3): el último origen será una sugerencia que habrá que confirmar en el mismo panel antes de calcular. Sumaremos referencias reconocibles, como biblioteca y comedor, para elegir desde dónde salir. Para las aulas de la prueba, agregaremos la entrada, el piso y la escalera o ascensor que corresponda, con datos verificados: llegar al edificio no alcanza para cumplir la hipótesis.</w:t>
+      </w:r>
+    </w:p>
+    <w:p>
+      <w:pPr>
+        <w:spacing w:after="100" w:line="247" w:lineRule="auto"/>
+        <w:jc w:val="both"/>
+        <w:rPr>
+          <w:bCs/>
+          <w:lang w:val="es-AR"/>
+        </w:rPr>
+      </w:pPr>
+      <w:r>
+        <w:rPr>
+          <w:lang w:val="es-AR"/>
+        </w:rPr>
+        <w:t>Conectividad y espera (5, 7 y 8): mostraremos “Buscando el camino…” durante el cálculo y “Sin conexión” con la opción de reintentar cuando falle. Conservaremos el mapa y la ruta ya cargados durante el recorrido, sin exigir nuevas consultas; si todavía no hay ruta, mantendremos el mapa disponible. Si falla el servicio de clima simulado, avisaremos que no pudo consultarse y permitiremos elegir el criterio, sin asumir que no llueve.</w:t>
+      </w:r>
+    </w:p>
+    <w:p>
+      <w:pPr>
+        <w:spacing w:after="100" w:line="247" w:lineRule="auto"/>
+        <w:jc w:val="both"/>
+        <w:rPr>
+          <w:bCs/>
+          <w:lang w:val="es-AR"/>
+        </w:rPr>
+      </w:pPr>
+      <w:r>
+        <w:rPr>
+          <w:lang w:val="es-AR"/>
+        </w:rPr>
+        <w:t>Claridad del recorrido (9, 10, 11 y 12): cambiaremos “-” por “Sin acceso ahora”, agregaremos una indicación breve cuando no haya destinos recientes y unificaremos los nombres del mapa y la lista. Al cambiar el origen, el destino seguirá visible; si aún no se eligió ninguno, volveremos al inicio sin generar una ruta al Aula 4.</w:t>
+      </w:r>
+    </w:p>
+    <w:p>
+      <w:pPr>
+        <w:spacing w:after="100" w:line="247" w:lineRule="auto"/>
+        <w:jc w:val="both"/>
+        <w:rPr>
+          <w:bCs/>
+          <w:lang w:val="es-AR"/>
+        </w:rPr>
+      </w:pPr>
+      <w:r>
+        <w:rPr>
+          <w:b/>
+          <w:lang w:val="es-AR"/>
+        </w:rPr>
+        <w:t xml:space="preserve">Problemas que cuestionamos. </w:t>
+      </w:r>
+      <w:r>
+        <w:rPr>
+          <w:lang w:val="es-AR"/>
+        </w:rPr>
+        <w:t>En el punto 4 aceptamos la necesidad de reflejar cierres, pero no que debamos resolverla con reportes de fotos y texto en este MVP. El TP2 registró accesos cerrados en cuatro de cinco casos, pero no relevó disposición a reportarlos ni cómo validar esos avisos; además, todos tienen señal irregular. En el TP5 precargaremos los cierres y el motor los excluirá, como se definió en el TP3. El reporte colaborativo requiere validación posterior.</w:t>
+      </w:r>
+    </w:p>
+    <w:p>
+      <w:pPr>
+        <w:spacing w:after="100" w:line="247" w:lineRule="auto"/>
+        <w:jc w:val="both"/>
+        <w:rPr>
+          <w:bCs/>
+          <w:lang w:val="es-AR"/>
+        </w:rPr>
+      </w:pPr>
+      <w:r>
+        <w:rPr>
+          <w:lang w:val="es-AR"/>
+        </w:rPr>
+        <w:t>En el punto 6 aceptamos que falta orientación, pero cuestionamos la severidad 3 y la necesidad de una sección de tutoriales. El TP2 muestra consultas apuradas y pérdida de tiempo, sin evidencia de que una guía extensa sea necesaria. Incluiremos ayuda breve junto a los controles y en el primer uso; probaremos si alcanza con los usuarios.</w:t>
+      </w:r>
+    </w:p>
+    <w:p>
+      <w:pPr>
+        <w:spacing w:after="100" w:line="247" w:lineRule="auto"/>
+        <w:jc w:val="both"/>
+        <w:rPr>
+          <w:bCs/>
+          <w:lang w:val="es-AR"/>
+        </w:rPr>
+      </w:pPr>
+      <w:r>
+        <w:rPr>
+          <w:b/>
+          <w:lang w:val="es-AR"/>
+        </w:rPr>
+        <w:t xml:space="preserve">Qué queda para después y qué aprendimos. </w:t>
+      </w:r>
+      <w:r>
+        <w:rPr>
+          <w:lang w:val="es-AR"/>
+        </w:rPr>
+        <w:t>Postergamos la selección de un punto libre sobre el mapa (2) y las guías extensas (6), hasta evaluar si las referencias y la ayuda breve resultan suficientes; los reportes colaborativos (4) también quedan pendientes. Aprendimos que pocos toques no garantizan eficiencia: un origen equivocado o una llegada incompleta devuelve el tiempo ahorrado. En el TP5 comprobaremos si cuatro de cinco usuarios llegan en menos de cinco minutos, sin pedir indicaciones ni tomar un acceso cerrado.</w:t>
+      </w:r>
+    </w:p>
     <w:sectPr>
       <w:headerReference w:type="default" r:id="rId15"/>
       <w:footerReference w:type="default" r:id="rId16"/>
@@ -6285,7 +5791,7 @@
 </file>
 
 <file path=word/endnotes.xml><?xml version="1.0" encoding="utf-8"?>
-<w:endnotes xmlns:wpc="http://schemas.microsoft.com/office/word/2010/wordprocessingCanvas" xmlns:cx="http://schemas.microsoft.com/office/drawing/2014/chartex" xmlns:cx1="http://schemas.microsoft.com/office/drawing/2015/9/8/chartex" xmlns:cx2="http://schemas.microsoft.com/office/drawing/2015/10/21/chartex" xmlns:cx3="http://schemas.microsoft.com/office/drawing/2016/5/9/chartex" xmlns:cx4="http://schemas.microsoft.com/office/drawing/2016/5/10/chartex" xmlns:cx5="http://schemas.microsoft.com/office/drawing/2016/5/11/chartex" xmlns:cx6="http://schemas.microsoft.com/office/drawing/2016/5/12/chartex" xmlns:cx7="http://schemas.microsoft.com/office/drawing/2016/5/13/chartex" xmlns:cx8="http://schemas.microsoft.com/office/drawing/2016/5/14/chartex" xmlns:mc="http://schemas.openxmlformats.org/markup-compatibility/2006" xmlns:m="http://schemas.openxmlformats.org/officeDocument/2006/math" xmlns:aink="http://schemas.microsoft.com/office/drawing/2016/ink" xmlns:am3d="http://schemas.microsoft.com/office/drawing/2017/model3d" xmlns:oel="http://schemas.microsoft.com/office/2019/extlst" xmlns:r="http://schemas.openxmlformats.org/officeDocument/2006/relationships" xmlns:wp14="http://schemas.microsoft.com/office/word/2010/wordprocessingDrawing" xmlns:wp="http://schemas.openxmlformats.org/drawingml/2006/wordprocessingDrawing" xmlns:wpg="http://schemas.microsoft.com/office/word/2010/wordprocessingGroup" xmlns:wpi="http://schemas.microsoft.com/office/word/2010/wordprocessingInk" xmlns:wps="http://schemas.microsoft.com/office/word/2010/wordprocessingShape" xmlns:o="urn:schemas-microsoft-com:office:office" xmlns:v="urn:schemas-microsoft-com:vml" xmlns:w10="urn:schemas-microsoft-com:office:word" xmlns:w="http://schemas.openxmlformats.org/wordprocessingml/2006/main" xmlns:w14="http://schemas.microsoft.com/office/word/2010/wordml" xmlns:w15="http://schemas.microsoft.com/office/word/2012/wordml" xmlns:w16cex="http://schemas.microsoft.com/office/word/2018/wordml/cex" xmlns:w16cid="http://schemas.microsoft.com/office/word/2016/wordml/cid" xmlns:w16="http://schemas.microsoft.com/office/word/2018/wordml" xmlns:w16sdtdh="http://schemas.microsoft.com/office/word/2020/wordml/sdtdatahash" xmlns:w16sdtfl="http://schemas.microsoft.com/office/word/2024/wordml/sdtformatlock" xmlns:w16se="http://schemas.microsoft.com/office/word/2015/wordml/symex" xmlns:w16du="http://schemas.microsoft.com/office/word/2023/wordml/word16du" xmlns:wne="http://schemas.microsoft.com/office/word/2006/wordml" mc:Ignorable="w14 w15 w16se w16cid w16 w16cex w16sdtdh w16sdtfl w16du wp14">
+<w:endnotes xmlns:wpc="http://schemas.microsoft.com/office/word/2010/wordprocessingCanvas" xmlns:cx="http://schemas.microsoft.com/office/drawing/2014/chartex" xmlns:cx1="http://schemas.microsoft.com/office/drawing/2015/9/8/chartex" xmlns:cx2="http://schemas.microsoft.com/office/drawing/2015/10/21/chartex" xmlns:cx3="http://schemas.microsoft.com/office/drawing/2016/5/9/chartex" xmlns:cx4="http://schemas.microsoft.com/office/drawing/2016/5/10/chartex" xmlns:cx5="http://schemas.microsoft.com/office/drawing/2016/5/11/chartex" xmlns:cx6="http://schemas.microsoft.com/office/drawing/2016/5/12/chartex" xmlns:cx7="http://schemas.microsoft.com/office/drawing/2016/5/13/chartex" xmlns:cx8="http://schemas.microsoft.com/office/drawing/2016/5/14/chartex" xmlns:mc="http://schemas.openxmlformats.org/markup-compatibility/2006" xmlns:aink="http://schemas.microsoft.com/office/drawing/2016/ink" xmlns:am3d="http://schemas.microsoft.com/office/drawing/2017/model3d" xmlns:o="urn:schemas-microsoft-com:office:office" xmlns:oel="http://schemas.microsoft.com/office/2019/extlst" xmlns:r="http://schemas.openxmlformats.org/officeDocument/2006/relationships" xmlns:m="http://schemas.openxmlformats.org/officeDocument/2006/math" xmlns:v="urn:schemas-microsoft-com:vml" xmlns:wp14="http://schemas.microsoft.com/office/word/2010/wordprocessingDrawing" xmlns:wp="http://schemas.openxmlformats.org/drawingml/2006/wordprocessingDrawing" xmlns:w10="urn:schemas-microsoft-com:office:word" xmlns:w="http://schemas.openxmlformats.org/wordprocessingml/2006/main" xmlns:w14="http://schemas.microsoft.com/office/word/2010/wordml" xmlns:w15="http://schemas.microsoft.com/office/word/2012/wordml" xmlns:w16cex="http://schemas.microsoft.com/office/word/2018/wordml/cex" xmlns:w16cid="http://schemas.microsoft.com/office/word/2016/wordml/cid" xmlns:w16="http://schemas.microsoft.com/office/word/2018/wordml" xmlns:w16du="http://schemas.microsoft.com/office/word/2023/wordml/word16du" xmlns:w16sdtdh="http://schemas.microsoft.com/office/word/2020/wordml/sdtdatahash" xmlns:w16sdtfl="http://schemas.microsoft.com/office/word/2024/wordml/sdtformatlock" xmlns:w16se="http://schemas.microsoft.com/office/word/2015/wordml/symex" xmlns:wpg="http://schemas.microsoft.com/office/word/2010/wordprocessingGroup" xmlns:wpi="http://schemas.microsoft.com/office/word/2010/wordprocessingInk" xmlns:wne="http://schemas.microsoft.com/office/word/2006/wordml" xmlns:wps="http://schemas.microsoft.com/office/word/2010/wordprocessingShape" mc:Ignorable="w14 w15 w16se w16cid w16 w16cex w16sdtdh w16sdtfl w16du wp14">
   <w:endnote w:type="separator" w:id="-1">
     <w:p>
       <w:pPr>
@@ -6310,7 +5816,7 @@
 </file>
 
 <file path=word/footer1.xml><?xml version="1.0" encoding="utf-8"?>
-<w:ftr xmlns:wpc="http://schemas.microsoft.com/office/word/2010/wordprocessingCanvas" xmlns:cx="http://schemas.microsoft.com/office/drawing/2014/chartex" xmlns:cx1="http://schemas.microsoft.com/office/drawing/2015/9/8/chartex" xmlns:cx2="http://schemas.microsoft.com/office/drawing/2015/10/21/chartex" xmlns:cx3="http://schemas.microsoft.com/office/drawing/2016/5/9/chartex" xmlns:cx4="http://schemas.microsoft.com/office/drawing/2016/5/10/chartex" xmlns:cx5="http://schemas.microsoft.com/office/drawing/2016/5/11/chartex" xmlns:cx6="http://schemas.microsoft.com/office/drawing/2016/5/12/chartex" xmlns:cx7="http://schemas.microsoft.com/office/drawing/2016/5/13/chartex" xmlns:cx8="http://schemas.microsoft.com/office/drawing/2016/5/14/chartex" xmlns:mc="http://schemas.openxmlformats.org/markup-compatibility/2006" xmlns:m="http://schemas.openxmlformats.org/officeDocument/2006/math" xmlns:aink="http://schemas.microsoft.com/office/drawing/2016/ink" xmlns:am3d="http://schemas.microsoft.com/office/drawing/2017/model3d" xmlns:oel="http://schemas.microsoft.com/office/2019/extlst" xmlns:r="http://schemas.openxmlformats.org/officeDocument/2006/relationships" xmlns:wp14="http://schemas.microsoft.com/office/word/2010/wordprocessingDrawing" xmlns:wp="http://schemas.openxmlformats.org/drawingml/2006/wordprocessingDrawing" xmlns:wpg="http://schemas.microsoft.com/office/word/2010/wordprocessingGroup" xmlns:wpi="http://schemas.microsoft.com/office/word/2010/wordprocessingInk" xmlns:wps="http://schemas.microsoft.com/office/word/2010/wordprocessingShape" xmlns:o="urn:schemas-microsoft-com:office:office" xmlns:v="urn:schemas-microsoft-com:vml" xmlns:w10="urn:schemas-microsoft-com:office:word" xmlns:w="http://schemas.openxmlformats.org/wordprocessingml/2006/main" xmlns:w14="http://schemas.microsoft.com/office/word/2010/wordml" xmlns:w15="http://schemas.microsoft.com/office/word/2012/wordml" xmlns:w16cex="http://schemas.microsoft.com/office/word/2018/wordml/cex" xmlns:w16cid="http://schemas.microsoft.com/office/word/2016/wordml/cid" xmlns:w16="http://schemas.microsoft.com/office/word/2018/wordml" xmlns:w16sdtdh="http://schemas.microsoft.com/office/word/2020/wordml/sdtdatahash" xmlns:w16sdtfl="http://schemas.microsoft.com/office/word/2024/wordml/sdtformatlock" xmlns:w16se="http://schemas.microsoft.com/office/word/2015/wordml/symex" xmlns:w16du="http://schemas.microsoft.com/office/word/2023/wordml/word16du" xmlns:wne="http://schemas.microsoft.com/office/word/2006/wordml" mc:Ignorable="w14 w15 w16se w16cid w16 w16cex w16sdtdh w16sdtfl w16du wp14">
+<w:ftr xmlns:wpc="http://schemas.microsoft.com/office/word/2010/wordprocessingCanvas" xmlns:cx="http://schemas.microsoft.com/office/drawing/2014/chartex" xmlns:cx1="http://schemas.microsoft.com/office/drawing/2015/9/8/chartex" xmlns:cx2="http://schemas.microsoft.com/office/drawing/2015/10/21/chartex" xmlns:cx3="http://schemas.microsoft.com/office/drawing/2016/5/9/chartex" xmlns:cx4="http://schemas.microsoft.com/office/drawing/2016/5/10/chartex" xmlns:cx5="http://schemas.microsoft.com/office/drawing/2016/5/11/chartex" xmlns:cx6="http://schemas.microsoft.com/office/drawing/2016/5/12/chartex" xmlns:cx7="http://schemas.microsoft.com/office/drawing/2016/5/13/chartex" xmlns:cx8="http://schemas.microsoft.com/office/drawing/2016/5/14/chartex" xmlns:mc="http://schemas.openxmlformats.org/markup-compatibility/2006" xmlns:aink="http://schemas.microsoft.com/office/drawing/2016/ink" xmlns:am3d="http://schemas.microsoft.com/office/drawing/2017/model3d" xmlns:o="urn:schemas-microsoft-com:office:office" xmlns:oel="http://schemas.microsoft.com/office/2019/extlst" xmlns:r="http://schemas.openxmlformats.org/officeDocument/2006/relationships" xmlns:m="http://schemas.openxmlformats.org/officeDocument/2006/math" xmlns:v="urn:schemas-microsoft-com:vml" xmlns:wp14="http://schemas.microsoft.com/office/word/2010/wordprocessingDrawing" xmlns:wp="http://schemas.openxmlformats.org/drawingml/2006/wordprocessingDrawing" xmlns:w10="urn:schemas-microsoft-com:office:word" xmlns:w="http://schemas.openxmlformats.org/wordprocessingml/2006/main" xmlns:w14="http://schemas.microsoft.com/office/word/2010/wordml" xmlns:w15="http://schemas.microsoft.com/office/word/2012/wordml" xmlns:w16cex="http://schemas.microsoft.com/office/word/2018/wordml/cex" xmlns:w16cid="http://schemas.microsoft.com/office/word/2016/wordml/cid" xmlns:w16="http://schemas.microsoft.com/office/word/2018/wordml" xmlns:w16du="http://schemas.microsoft.com/office/word/2023/wordml/word16du" xmlns:w16sdtdh="http://schemas.microsoft.com/office/word/2020/wordml/sdtdatahash" xmlns:w16sdtfl="http://schemas.microsoft.com/office/word/2024/wordml/sdtformatlock" xmlns:w16se="http://schemas.microsoft.com/office/word/2015/wordml/symex" xmlns:wpg="http://schemas.microsoft.com/office/word/2010/wordprocessingGroup" xmlns:wpi="http://schemas.microsoft.com/office/word/2010/wordprocessingInk" xmlns:wne="http://schemas.microsoft.com/office/word/2006/wordml" xmlns:wps="http://schemas.microsoft.com/office/word/2010/wordprocessingShape" mc:Ignorable="w14 w15 w16se w16cid w16 w16cex w16sdtdh w16sdtfl w16du wp14">
   <w:p>
     <w:pPr>
       <w:pStyle w:val="Piedepgina"/>
@@ -6407,7 +5913,7 @@
 </file>
 
 <file path=word/footnotes.xml><?xml version="1.0" encoding="utf-8"?>
-<w:footnotes xmlns:wpc="http://schemas.microsoft.com/office/word/2010/wordprocessingCanvas" xmlns:cx="http://schemas.microsoft.com/office/drawing/2014/chartex" xmlns:cx1="http://schemas.microsoft.com/office/drawing/2015/9/8/chartex" xmlns:cx2="http://schemas.microsoft.com/office/drawing/2015/10/21/chartex" xmlns:cx3="http://schemas.microsoft.com/office/drawing/2016/5/9/chartex" xmlns:cx4="http://schemas.microsoft.com/office/drawing/2016/5/10/chartex" xmlns:cx5="http://schemas.microsoft.com/office/drawing/2016/5/11/chartex" xmlns:cx6="http://schemas.microsoft.com/office/drawing/2016/5/12/chartex" xmlns:cx7="http://schemas.microsoft.com/office/drawing/2016/5/13/chartex" xmlns:cx8="http://schemas.microsoft.com/office/drawing/2016/5/14/chartex" xmlns:mc="http://schemas.openxmlformats.org/markup-compatibility/2006" xmlns:m="http://schemas.openxmlformats.org/officeDocument/2006/math" xmlns:aink="http://schemas.microsoft.com/office/drawing/2016/ink" xmlns:am3d="http://schemas.microsoft.com/office/drawing/2017/model3d" xmlns:oel="http://schemas.microsoft.com/office/2019/extlst" xmlns:r="http://schemas.openxmlformats.org/officeDocument/2006/relationships" xmlns:wp14="http://schemas.microsoft.com/office/word/2010/wordprocessingDrawing" xmlns:wp="http://schemas.openxmlformats.org/drawingml/2006/wordprocessingDrawing" xmlns:wpg="http://schemas.microsoft.com/office/word/2010/wordprocessingGroup" xmlns:wpi="http://schemas.microsoft.com/office/word/2010/wordprocessingInk" xmlns:wps="http://schemas.microsoft.com/office/word/2010/wordprocessingShape" xmlns:o="urn:schemas-microsoft-com:office:office" xmlns:v="urn:schemas-microsoft-com:vml" xmlns:w10="urn:schemas-microsoft-com:office:word" xmlns:w="http://schemas.openxmlformats.org/wordprocessingml/2006/main" xmlns:w14="http://schemas.microsoft.com/office/word/2010/wordml" xmlns:w15="http://schemas.microsoft.com/office/word/2012/wordml" xmlns:w16cex="http://schemas.microsoft.com/office/word/2018/wordml/cex" xmlns:w16cid="http://schemas.microsoft.com/office/word/2016/wordml/cid" xmlns:w16="http://schemas.microsoft.com/office/word/2018/wordml" xmlns:w16sdtdh="http://schemas.microsoft.com/office/word/2020/wordml/sdtdatahash" xmlns:w16sdtfl="http://schemas.microsoft.com/office/word/2024/wordml/sdtformatlock" xmlns:w16se="http://schemas.microsoft.com/office/word/2015/wordml/symex" xmlns:w16du="http://schemas.microsoft.com/office/word/2023/wordml/word16du" xmlns:wne="http://schemas.microsoft.com/office/word/2006/wordml" mc:Ignorable="w14 w15 w16se w16cid w16 w16cex w16sdtdh w16sdtfl w16du wp14">
+<w:footnotes xmlns:wpc="http://schemas.microsoft.com/office/word/2010/wordprocessingCanvas" xmlns:cx="http://schemas.microsoft.com/office/drawing/2014/chartex" xmlns:cx1="http://schemas.microsoft.com/office/drawing/2015/9/8/chartex" xmlns:cx2="http://schemas.microsoft.com/office/drawing/2015/10/21/chartex" xmlns:cx3="http://schemas.microsoft.com/office/drawing/2016/5/9/chartex" xmlns:cx4="http://schemas.microsoft.com/office/drawing/2016/5/10/chartex" xmlns:cx5="http://schemas.microsoft.com/office/drawing/2016/5/11/chartex" xmlns:cx6="http://schemas.microsoft.com/office/drawing/2016/5/12/chartex" xmlns:cx7="http://schemas.microsoft.com/office/drawing/2016/5/13/chartex" xmlns:cx8="http://schemas.microsoft.com/office/drawing/2016/5/14/chartex" xmlns:mc="http://schemas.openxmlformats.org/markup-compatibility/2006" xmlns:aink="http://schemas.microsoft.com/office/drawing/2016/ink" xmlns:am3d="http://schemas.microsoft.com/office/drawing/2017/model3d" xmlns:o="urn:schemas-microsoft-com:office:office" xmlns:oel="http://schemas.microsoft.com/office/2019/extlst" xmlns:r="http://schemas.openxmlformats.org/officeDocument/2006/relationships" xmlns:m="http://schemas.openxmlformats.org/officeDocument/2006/math" xmlns:v="urn:schemas-microsoft-com:vml" xmlns:wp14="http://schemas.microsoft.com/office/word/2010/wordprocessingDrawing" xmlns:wp="http://schemas.openxmlformats.org/drawingml/2006/wordprocessingDrawing" xmlns:w10="urn:schemas-microsoft-com:office:word" xmlns:w="http://schemas.openxmlformats.org/wordprocessingml/2006/main" xmlns:w14="http://schemas.microsoft.com/office/word/2010/wordml" xmlns:w15="http://schemas.microsoft.com/office/word/2012/wordml" xmlns:w16cex="http://schemas.microsoft.com/office/word/2018/wordml/cex" xmlns:w16cid="http://schemas.microsoft.com/office/word/2016/wordml/cid" xmlns:w16="http://schemas.microsoft.com/office/word/2018/wordml" xmlns:w16du="http://schemas.microsoft.com/office/word/2023/wordml/word16du" xmlns:w16sdtdh="http://schemas.microsoft.com/office/word/2020/wordml/sdtdatahash" xmlns:w16sdtfl="http://schemas.microsoft.com/office/word/2024/wordml/sdtformatlock" xmlns:w16se="http://schemas.microsoft.com/office/word/2015/wordml/symex" xmlns:wpg="http://schemas.microsoft.com/office/word/2010/wordprocessingGroup" xmlns:wpi="http://schemas.microsoft.com/office/word/2010/wordprocessingInk" xmlns:wne="http://schemas.microsoft.com/office/word/2006/wordml" xmlns:wps="http://schemas.microsoft.com/office/word/2010/wordprocessingShape" mc:Ignorable="w14 w15 w16se w16cid w16 w16cex w16sdtdh w16sdtfl w16du wp14">
   <w:footnote w:type="separator" w:id="-1">
     <w:p>
       <w:pPr>
@@ -6432,7 +5938,7 @@
 </file>
 
 <file path=word/header1.xml><?xml version="1.0" encoding="utf-8"?>
-<w:hdr xmlns:wpc="http://schemas.microsoft.com/office/word/2010/wordprocessingCanvas" xmlns:cx="http://schemas.microsoft.com/office/drawing/2014/chartex" xmlns:cx1="http://schemas.microsoft.com/office/drawing/2015/9/8/chartex" xmlns:cx2="http://schemas.microsoft.com/office/drawing/2015/10/21/chartex" xmlns:cx3="http://schemas.microsoft.com/office/drawing/2016/5/9/chartex" xmlns:cx4="http://schemas.microsoft.com/office/drawing/2016/5/10/chartex" xmlns:cx5="http://schemas.microsoft.com/office/drawing/2016/5/11/chartex" xmlns:cx6="http://schemas.microsoft.com/office/drawing/2016/5/12/chartex" xmlns:cx7="http://schemas.microsoft.com/office/drawing/2016/5/13/chartex" xmlns:cx8="http://schemas.microsoft.com/office/drawing/2016/5/14/chartex" xmlns:mc="http://schemas.openxmlformats.org/markup-compatibility/2006" xmlns:m="http://schemas.openxmlformats.org/officeDocument/2006/math" xmlns:aink="http://schemas.microsoft.com/office/drawing/2016/ink" xmlns:am3d="http://schemas.microsoft.com/office/drawing/2017/model3d" xmlns:oel="http://schemas.microsoft.com/office/2019/extlst" xmlns:r="http://schemas.openxmlformats.org/officeDocument/2006/relationships" xmlns:wp14="http://schemas.microsoft.com/office/word/2010/wordprocessingDrawing" xmlns:wp="http://schemas.openxmlformats.org/drawingml/2006/wordprocessingDrawing" xmlns:wpg="http://schemas.microsoft.com/office/word/2010/wordprocessingGroup" xmlns:wpi="http://schemas.microsoft.com/office/word/2010/wordprocessingInk" xmlns:wps="http://schemas.microsoft.com/office/word/2010/wordprocessingShape" xmlns:o="urn:schemas-microsoft-com:office:office" xmlns:v="urn:schemas-microsoft-com:vml" xmlns:w10="urn:schemas-microsoft-com:office:word" xmlns:w="http://schemas.openxmlformats.org/wordprocessingml/2006/main" xmlns:w14="http://schemas.microsoft.com/office/word/2010/wordml" xmlns:w15="http://schemas.microsoft.com/office/word/2012/wordml" xmlns:w16cex="http://schemas.microsoft.com/office/word/2018/wordml/cex" xmlns:w16cid="http://schemas.microsoft.com/office/word/2016/wordml/cid" xmlns:w16="http://schemas.microsoft.com/office/word/2018/wordml" xmlns:w16sdtdh="http://schemas.microsoft.com/office/word/2020/wordml/sdtdatahash" xmlns:w16sdtfl="http://schemas.microsoft.com/office/word/2024/wordml/sdtformatlock" xmlns:w16se="http://schemas.microsoft.com/office/word/2015/wordml/symex" xmlns:w16du="http://schemas.microsoft.com/office/word/2023/wordml/word16du" xmlns:wne="http://schemas.microsoft.com/office/word/2006/wordml" mc:Ignorable="w14 w15 w16se w16cid w16 w16cex w16sdtdh w16sdtfl w16du wp14">
+<w:hdr xmlns:wpc="http://schemas.microsoft.com/office/word/2010/wordprocessingCanvas" xmlns:cx="http://schemas.microsoft.com/office/drawing/2014/chartex" xmlns:cx1="http://schemas.microsoft.com/office/drawing/2015/9/8/chartex" xmlns:cx2="http://schemas.microsoft.com/office/drawing/2015/10/21/chartex" xmlns:cx3="http://schemas.microsoft.com/office/drawing/2016/5/9/chartex" xmlns:cx4="http://schemas.microsoft.com/office/drawing/2016/5/10/chartex" xmlns:cx5="http://schemas.microsoft.com/office/drawing/2016/5/11/chartex" xmlns:cx6="http://schemas.microsoft.com/office/drawing/2016/5/12/chartex" xmlns:cx7="http://schemas.microsoft.com/office/drawing/2016/5/13/chartex" xmlns:cx8="http://schemas.microsoft.com/office/drawing/2016/5/14/chartex" xmlns:mc="http://schemas.openxmlformats.org/markup-compatibility/2006" xmlns:aink="http://schemas.microsoft.com/office/drawing/2016/ink" xmlns:am3d="http://schemas.microsoft.com/office/drawing/2017/model3d" xmlns:o="urn:schemas-microsoft-com:office:office" xmlns:oel="http://schemas.microsoft.com/office/2019/extlst" xmlns:r="http://schemas.openxmlformats.org/officeDocument/2006/relationships" xmlns:m="http://schemas.openxmlformats.org/officeDocument/2006/math" xmlns:v="urn:schemas-microsoft-com:vml" xmlns:wp14="http://schemas.microsoft.com/office/word/2010/wordprocessingDrawing" xmlns:wp="http://schemas.openxmlformats.org/drawingml/2006/wordprocessingDrawing" xmlns:w10="urn:schemas-microsoft-com:office:word" xmlns:w="http://schemas.openxmlformats.org/wordprocessingml/2006/main" xmlns:w14="http://schemas.microsoft.com/office/word/2010/wordml" xmlns:w15="http://schemas.microsoft.com/office/word/2012/wordml" xmlns:w16cex="http://schemas.microsoft.com/office/word/2018/wordml/cex" xmlns:w16cid="http://schemas.microsoft.com/office/word/2016/wordml/cid" xmlns:w16="http://schemas.microsoft.com/office/word/2018/wordml" xmlns:w16du="http://schemas.microsoft.com/office/word/2023/wordml/word16du" xmlns:w16sdtdh="http://schemas.microsoft.com/office/word/2020/wordml/sdtdatahash" xmlns:w16sdtfl="http://schemas.microsoft.com/office/word/2024/wordml/sdtformatlock" xmlns:w16se="http://schemas.microsoft.com/office/word/2015/wordml/symex" xmlns:wpg="http://schemas.microsoft.com/office/word/2010/wordprocessingGroup" xmlns:wpi="http://schemas.microsoft.com/office/word/2010/wordprocessingInk" xmlns:wne="http://schemas.microsoft.com/office/word/2006/wordml" xmlns:wps="http://schemas.microsoft.com/office/word/2010/wordprocessingShape" mc:Ignorable="w14 w15 w16se w16cid w16 w16cex w16sdtdh w16sdtfl w16du wp14">
   <w:tbl>
     <w:tblPr>
       <w:tblW w:w="9014" w:type="dxa"/>
@@ -6566,7 +6072,7 @@
 </file>
 
 <file path=word/numbering.xml><?xml version="1.0" encoding="utf-8"?>
-<w:numbering xmlns:wpc="http://schemas.microsoft.com/office/word/2010/wordprocessingCanvas" xmlns:cx="http://schemas.microsoft.com/office/drawing/2014/chartex" xmlns:cx1="http://schemas.microsoft.com/office/drawing/2015/9/8/chartex" xmlns:cx2="http://schemas.microsoft.com/office/drawing/2015/10/21/chartex" xmlns:cx3="http://schemas.microsoft.com/office/drawing/2016/5/9/chartex" xmlns:cx4="http://schemas.microsoft.com/office/drawing/2016/5/10/chartex" xmlns:cx5="http://schemas.microsoft.com/office/drawing/2016/5/11/chartex" xmlns:cx6="http://schemas.microsoft.com/office/drawing/2016/5/12/chartex" xmlns:cx7="http://schemas.microsoft.com/office/drawing/2016/5/13/chartex" xmlns:cx8="http://schemas.microsoft.com/office/drawing/2016/5/14/chartex" xmlns:mc="http://schemas.openxmlformats.org/markup-compatibility/2006" xmlns:m="http://schemas.openxmlformats.org/officeDocument/2006/math" xmlns:aink="http://schemas.microsoft.com/office/drawing/2016/ink" xmlns:am3d="http://schemas.microsoft.com/office/drawing/2017/model3d" xmlns:oel="http://schemas.microsoft.com/office/2019/extlst" xmlns:r="http://schemas.openxmlformats.org/officeDocument/2006/relationships" xmlns:wp14="http://schemas.microsoft.com/office/word/2010/wordprocessingDrawing" xmlns:wp="http://schemas.openxmlformats.org/drawingml/2006/wordprocessingDrawing" xmlns:wpg="http://schemas.microsoft.com/office/word/2010/wordprocessingGroup" xmlns:wpi="http://schemas.microsoft.com/office/word/2010/wordprocessingInk" xmlns:wps="http://schemas.microsoft.com/office/word/2010/wordprocessingShape" xmlns:o="urn:schemas-microsoft-com:office:office" xmlns:v="urn:schemas-microsoft-com:vml" xmlns:w10="urn:schemas-microsoft-com:office:word" xmlns:w="http://schemas.openxmlformats.org/wordprocessingml/2006/main" xmlns:w14="http://schemas.microsoft.com/office/word/2010/wordml" xmlns:w15="http://schemas.microsoft.com/office/word/2012/wordml" xmlns:w16cex="http://schemas.microsoft.com/office/word/2018/wordml/cex" xmlns:w16cid="http://schemas.microsoft.com/office/word/2016/wordml/cid" xmlns:w16="http://schemas.microsoft.com/office/word/2018/wordml" xmlns:w16sdtdh="http://schemas.microsoft.com/office/word/2020/wordml/sdtdatahash" xmlns:w16sdtfl="http://schemas.microsoft.com/office/word/2024/wordml/sdtformatlock" xmlns:w16se="http://schemas.microsoft.com/office/word/2015/wordml/symex" xmlns:w16du="http://schemas.microsoft.com/office/word/2023/wordml/word16du" xmlns:wne="http://schemas.microsoft.com/office/word/2006/wordml" mc:Ignorable="w14 w15 w16se w16cid w16 w16cex w16sdtdh w16sdtfl w16du wp14">
+<w:numbering xmlns:wpc="http://schemas.microsoft.com/office/word/2010/wordprocessingCanvas" xmlns:cx="http://schemas.microsoft.com/office/drawing/2014/chartex" xmlns:cx1="http://schemas.microsoft.com/office/drawing/2015/9/8/chartex" xmlns:cx2="http://schemas.microsoft.com/office/drawing/2015/10/21/chartex" xmlns:cx3="http://schemas.microsoft.com/office/drawing/2016/5/9/chartex" xmlns:cx4="http://schemas.microsoft.com/office/drawing/2016/5/10/chartex" xmlns:cx5="http://schemas.microsoft.com/office/drawing/2016/5/11/chartex" xmlns:cx6="http://schemas.microsoft.com/office/drawing/2016/5/12/chartex" xmlns:cx7="http://schemas.microsoft.com/office/drawing/2016/5/13/chartex" xmlns:cx8="http://schemas.microsoft.com/office/drawing/2016/5/14/chartex" xmlns:mc="http://schemas.openxmlformats.org/markup-compatibility/2006" xmlns:aink="http://schemas.microsoft.com/office/drawing/2016/ink" xmlns:am3d="http://schemas.microsoft.com/office/drawing/2017/model3d" xmlns:o="urn:schemas-microsoft-com:office:office" xmlns:oel="http://schemas.microsoft.com/office/2019/extlst" xmlns:r="http://schemas.openxmlformats.org/officeDocument/2006/relationships" xmlns:m="http://schemas.openxmlformats.org/officeDocument/2006/math" xmlns:v="urn:schemas-microsoft-com:vml" xmlns:wp14="http://schemas.microsoft.com/office/word/2010/wordprocessingDrawing" xmlns:wp="http://schemas.openxmlformats.org/drawingml/2006/wordprocessingDrawing" xmlns:w10="urn:schemas-microsoft-com:office:word" xmlns:w="http://schemas.openxmlformats.org/wordprocessingml/2006/main" xmlns:w14="http://schemas.microsoft.com/office/word/2010/wordml" xmlns:w15="http://schemas.microsoft.com/office/word/2012/wordml" xmlns:w16cex="http://schemas.microsoft.com/office/word/2018/wordml/cex" xmlns:w16cid="http://schemas.microsoft.com/office/word/2016/wordml/cid" xmlns:w16="http://schemas.microsoft.com/office/word/2018/wordml" xmlns:w16du="http://schemas.microsoft.com/office/word/2023/wordml/word16du" xmlns:w16sdtdh="http://schemas.microsoft.com/office/word/2020/wordml/sdtdatahash" xmlns:w16sdtfl="http://schemas.microsoft.com/office/word/2024/wordml/sdtformatlock" xmlns:w16se="http://schemas.microsoft.com/office/word/2015/wordml/symex" xmlns:wpg="http://schemas.microsoft.com/office/word/2010/wordprocessingGroup" xmlns:wpi="http://schemas.microsoft.com/office/word/2010/wordprocessingInk" xmlns:wne="http://schemas.microsoft.com/office/word/2006/wordml" xmlns:wps="http://schemas.microsoft.com/office/word/2010/wordprocessingShape" mc:Ignorable="w14 w15 w16se w16cid w16 w16cex w16sdtdh w16sdtfl w16du wp14">
   <w:abstractNum w:abstractNumId="0" w15:restartNumberingAfterBreak="0">
     <w:nsid w:val="FFFFFF7C"/>
     <w:multiLevelType w:val="singleLevel"/>
@@ -6769,7 +6275,7 @@
 </file>
 
 <file path=word/styles.xml><?xml version="1.0" encoding="utf-8"?>
-<w:styles xmlns:mc="http://schemas.openxmlformats.org/markup-compatibility/2006" xmlns:r="http://schemas.openxmlformats.org/officeDocument/2006/relationships" xmlns:w="http://schemas.openxmlformats.org/wordprocessingml/2006/main" xmlns:w14="http://schemas.microsoft.com/office/word/2010/wordml" xmlns:w15="http://schemas.microsoft.com/office/word/2012/wordml" xmlns:w16cex="http://schemas.microsoft.com/office/word/2018/wordml/cex" xmlns:w16cid="http://schemas.microsoft.com/office/word/2016/wordml/cid" xmlns:w16="http://schemas.microsoft.com/office/word/2018/wordml" xmlns:w16sdtdh="http://schemas.microsoft.com/office/word/2020/wordml/sdtdatahash" xmlns:w16sdtfl="http://schemas.microsoft.com/office/word/2024/wordml/sdtformatlock" xmlns:w16se="http://schemas.microsoft.com/office/word/2015/wordml/symex" xmlns:w16du="http://schemas.microsoft.com/office/word/2023/wordml/word16du" mc:Ignorable="w14 w15 w16se w16cid w16 w16cex w16sdtdh w16sdtfl w16du">
+<w:styles xmlns:mc="http://schemas.openxmlformats.org/markup-compatibility/2006" xmlns:r="http://schemas.openxmlformats.org/officeDocument/2006/relationships" xmlns:w="http://schemas.openxmlformats.org/wordprocessingml/2006/main" xmlns:w14="http://schemas.microsoft.com/office/word/2010/wordml" xmlns:w15="http://schemas.microsoft.com/office/word/2012/wordml" xmlns:w16cex="http://schemas.microsoft.com/office/word/2018/wordml/cex" xmlns:w16cid="http://schemas.microsoft.com/office/word/2016/wordml/cid" xmlns:w16="http://schemas.microsoft.com/office/word/2018/wordml" xmlns:w16du="http://schemas.microsoft.com/office/word/2023/wordml/word16du" xmlns:w16sdtdh="http://schemas.microsoft.com/office/word/2020/wordml/sdtdatahash" xmlns:w16sdtfl="http://schemas.microsoft.com/office/word/2024/wordml/sdtformatlock" xmlns:w16se="http://schemas.microsoft.com/office/word/2015/wordml/symex" mc:Ignorable="w14 w15 w16se w16cid w16 w16cex w16sdtdh w16sdtfl w16du">
   <w:docDefaults>
     <w:rPrDefault>
       <w:rPr>

</xml_diff>